<commit_message>
Huck: revisão Parte 4
Co-Authored-By: Claude Opus 5.5 <noreply@anthropic.com>
Claude-Session: https://claude.ai/code/session_01MJjUEEZrxQDEUifKK2vj9g
</commit_message>
<xml_diff>
--- a/roteiros/luciano-huck/Huck_Parte4.docx
+++ b/roteiros/luciano-huck/Huck_Parte4.docx
@@ -79,7 +79,7 @@
         <w:rPr>
           <w:color w:val="C00000"/>
         </w:rPr>
-        <w:t>Pense no que isso significava. O banco de Vorcaro estava sem saída. E, segundo as mensagens, era justamente nesse período que Luciano Huck continuava mandando recados de apoio ao amigo. Um deles, o último, ia ser enviado numa das noites mais dramáticas da história recente do sistema bancário brasileiro.</w:t>
+        <w:t>Pense no que isso significava. O banco de Vorcaro estava sem saída. E, segundo as mensagens, ao longo de dois mil e vinte e cinco Luciano Huck continuou mandando recados de apoio ao amigo. Um deles, o último, ia ser enviado numa das noites mais dramáticas da história recente do sistema bancário brasileiro.</w:t>
       </w:r>
     </w:p>
     <w:p>
@@ -111,7 +111,7 @@
         <w:rPr>
           <w:color w:val="000000"/>
         </w:rPr>
-        <w:t>É a mensagem de alguém que sabe que o amigo está passando por um momento difícil. E que quer estar perto.</w:t>
+        <w:t>É o tom de quem se preocupa com um amigo.</w:t>
       </w:r>
     </w:p>
     <w:p>
@@ -231,7 +231,7 @@
         <w:rPr>
           <w:color w:val="000000"/>
         </w:rPr>
-        <w:t>Leia de novo, com calma, sabendo o que aconteceu depois.</w:t>
+        <w:t>Leia de novo, com calma, sabendo o que aconteceu naquela mesma noite.</w:t>
       </w:r>
     </w:p>
     <w:p>
@@ -239,7 +239,7 @@
         <w:rPr>
           <w:color w:val="000000"/>
         </w:rPr>
-        <w:t>Naquela mesma noite, Daniel Vorcaro foi até o Aeroporto Internacional de Guarulhos, em São Paulo.</w:t>
+        <w:t>Na noite daquela segunda-feira, Daniel Vorcaro estava no Aeroporto Internacional de Guarulhos, em São Paulo.</w:t>
       </w:r>
     </w:p>
     <w:p>
@@ -423,7 +423,7 @@
         <w:rPr>
           <w:color w:val="000000"/>
         </w:rPr>
-        <w:t>Em poucas horas, as reclamações começaram.</w:t>
+        <w:t>Logo, as reclamações começaram.</w:t>
       </w:r>
     </w:p>
     <w:p>

</xml_diff>